<commit_message>
mi pagina segmentada en componentes
</commit_message>
<xml_diff>
--- a/Reporte.docx
+++ b/Reporte.docx
@@ -35,6 +35,45 @@
         <w:t xml:space="preserve"> </w:t>
       </w:r>
     </w:p>
+    <w:p>
+      <w:r>
+        <w:drawing>
+          <wp:inline distT="0" distB="0" distL="0" distR="0" wp14:anchorId="29007911" wp14:editId="12315C5E">
+            <wp:extent cx="5944430" cy="1209844"/>
+            <wp:effectExtent l="0" t="0" r="0" b="9525"/>
+            <wp:docPr id="1" name="Imagen 1"/>
+            <wp:cNvGraphicFramePr>
+              <a:graphicFrameLocks xmlns:a="http://schemas.openxmlformats.org/drawingml/2006/main" noChangeAspect="1"/>
+            </wp:cNvGraphicFramePr>
+            <a:graphic xmlns:a="http://schemas.openxmlformats.org/drawingml/2006/main">
+              <a:graphicData uri="http://schemas.openxmlformats.org/drawingml/2006/picture">
+                <pic:pic xmlns:pic="http://schemas.openxmlformats.org/drawingml/2006/picture">
+                  <pic:nvPicPr>
+                    <pic:cNvPr id="1" name=""/>
+                    <pic:cNvPicPr/>
+                  </pic:nvPicPr>
+                  <pic:blipFill>
+                    <a:blip r:embed="rId4"/>
+                    <a:stretch>
+                      <a:fillRect/>
+                    </a:stretch>
+                  </pic:blipFill>
+                  <pic:spPr>
+                    <a:xfrm>
+                      <a:off x="0" y="0"/>
+                      <a:ext cx="5944430" cy="1209844"/>
+                    </a:xfrm>
+                    <a:prstGeom prst="rect">
+                      <a:avLst/>
+                    </a:prstGeom>
+                  </pic:spPr>
+                </pic:pic>
+              </a:graphicData>
+            </a:graphic>
+          </wp:inline>
+        </w:drawing>
+      </w:r>
+    </w:p>
     <w:p/>
     <w:p>
       <w:pPr>
@@ -48,14 +87,7 @@
           <w:b/>
           <w:bCs/>
         </w:rPr>
-        <w:t>2</w:t>
-      </w:r>
-      <w:r>
-        <w:rPr>
-          <w:b/>
-          <w:bCs/>
-        </w:rPr>
-        <w:t>. Creación de Ramas Personales</w:t>
+        <w:t>2. Creación de Ramas Personales</w:t>
       </w:r>
     </w:p>
     <w:p>
@@ -99,28 +131,106 @@
       <w:r>
         <w:t>Branch</w:t>
       </w:r>
+      <w:r>
+        <w:br/>
+      </w:r>
+      <w:r>
+        <w:drawing>
+          <wp:inline distT="0" distB="0" distL="0" distR="0" wp14:anchorId="529A93BD" wp14:editId="0F229587">
+            <wp:extent cx="5677692" cy="562053"/>
+            <wp:effectExtent l="0" t="0" r="0" b="9525"/>
+            <wp:docPr id="3" name="Imagen 3"/>
+            <wp:cNvGraphicFramePr>
+              <a:graphicFrameLocks xmlns:a="http://schemas.openxmlformats.org/drawingml/2006/main" noChangeAspect="1"/>
+            </wp:cNvGraphicFramePr>
+            <a:graphic xmlns:a="http://schemas.openxmlformats.org/drawingml/2006/main">
+              <a:graphicData uri="http://schemas.openxmlformats.org/drawingml/2006/picture">
+                <pic:pic xmlns:pic="http://schemas.openxmlformats.org/drawingml/2006/picture">
+                  <pic:nvPicPr>
+                    <pic:cNvPr id="1" name=""/>
+                    <pic:cNvPicPr/>
+                  </pic:nvPicPr>
+                  <pic:blipFill>
+                    <a:blip r:embed="rId5"/>
+                    <a:stretch>
+                      <a:fillRect/>
+                    </a:stretch>
+                  </pic:blipFill>
+                  <pic:spPr>
+                    <a:xfrm>
+                      <a:off x="0" y="0"/>
+                      <a:ext cx="5677692" cy="562053"/>
+                    </a:xfrm>
+                    <a:prstGeom prst="rect">
+                      <a:avLst/>
+                    </a:prstGeom>
+                  </pic:spPr>
+                </pic:pic>
+              </a:graphicData>
+            </a:graphic>
+          </wp:inline>
+        </w:drawing>
+      </w:r>
+      <w:r>
+        <w:br/>
+      </w:r>
+      <w:r>
+        <w:drawing>
+          <wp:inline distT="0" distB="0" distL="0" distR="0" wp14:anchorId="25D2FD2E" wp14:editId="1B31EE2B">
+            <wp:extent cx="6691630" cy="3073400"/>
+            <wp:effectExtent l="0" t="0" r="0" b="0"/>
+            <wp:docPr id="2" name="Imagen 2"/>
+            <wp:cNvGraphicFramePr>
+              <a:graphicFrameLocks xmlns:a="http://schemas.openxmlformats.org/drawingml/2006/main" noChangeAspect="1"/>
+            </wp:cNvGraphicFramePr>
+            <a:graphic xmlns:a="http://schemas.openxmlformats.org/drawingml/2006/main">
+              <a:graphicData uri="http://schemas.openxmlformats.org/drawingml/2006/picture">
+                <pic:pic xmlns:pic="http://schemas.openxmlformats.org/drawingml/2006/picture">
+                  <pic:nvPicPr>
+                    <pic:cNvPr id="1" name=""/>
+                    <pic:cNvPicPr/>
+                  </pic:nvPicPr>
+                  <pic:blipFill>
+                    <a:blip r:embed="rId6"/>
+                    <a:stretch>
+                      <a:fillRect/>
+                    </a:stretch>
+                  </pic:blipFill>
+                  <pic:spPr>
+                    <a:xfrm>
+                      <a:off x="0" y="0"/>
+                      <a:ext cx="6691630" cy="3073400"/>
+                    </a:xfrm>
+                    <a:prstGeom prst="rect">
+                      <a:avLst/>
+                    </a:prstGeom>
+                  </pic:spPr>
+                </pic:pic>
+              </a:graphicData>
+            </a:graphic>
+          </wp:inline>
+        </w:drawing>
+      </w:r>
     </w:p>
     <w:p/>
-    <w:p>
-      <w:pPr>
-        <w:rPr>
-          <w:b/>
-          <w:bCs/>
-        </w:rPr>
-      </w:pPr>
-      <w:r>
-        <w:rPr>
-          <w:b/>
-          <w:bCs/>
-        </w:rPr>
-        <w:t xml:space="preserve">3. </w:t>
-      </w:r>
-      <w:r>
-        <w:rPr>
-          <w:b/>
-          <w:bCs/>
-        </w:rPr>
-        <w:t>Configuración del Remoto</w:t>
+    <w:p/>
+    <w:p/>
+    <w:p/>
+    <w:p/>
+    <w:p>
+      <w:pPr>
+        <w:rPr>
+          <w:b/>
+          <w:bCs/>
+        </w:rPr>
+      </w:pPr>
+      <w:r>
+        <w:rPr>
+          <w:b/>
+          <w:bCs/>
+        </w:rPr>
+        <w:lastRenderedPageBreak/>
+        <w:t>3. Configuración del Remoto</w:t>
       </w:r>
     </w:p>
     <w:p>
@@ -157,7 +267,7 @@
       <w:r>
         <w:t xml:space="preserve"> </w:t>
       </w:r>
-      <w:hyperlink r:id="rId4" w:history="1">
+      <w:hyperlink r:id="rId7" w:history="1">
         <w:r>
           <w:rPr>
             <w:rStyle w:val="Hipervnculo"/>
@@ -179,25 +289,43 @@
           <w:b/>
           <w:bCs/>
         </w:rPr>
-        <w:t xml:space="preserve">4. </w:t>
-      </w:r>
-      <w:r>
-        <w:rPr>
-          <w:b/>
-          <w:bCs/>
-        </w:rPr>
-        <w:t>Subida de Archivos a GitHub</w:t>
-      </w:r>
-    </w:p>
-    <w:p>
-      <w:r>
-        <w:t>Se hace</w:t>
-      </w:r>
+        <w:t>4. Subida de Archivos a GitHub</w:t>
+      </w:r>
+    </w:p>
+    <w:p>
+      <w:r>
+        <w:t xml:space="preserve">Se hace </w:t>
+      </w:r>
+      <w:proofErr w:type="spellStart"/>
+      <w:r>
+        <w:t>git</w:t>
+      </w:r>
+      <w:proofErr w:type="spellEnd"/>
       <w:r>
         <w:t xml:space="preserve"> </w:t>
       </w:r>
       <w:proofErr w:type="spellStart"/>
       <w:r>
+        <w:t>push</w:t>
+      </w:r>
+      <w:proofErr w:type="spellEnd"/>
+      <w:r>
+        <w:t xml:space="preserve"> de</w:t>
+      </w:r>
+      <w:r>
+        <w:t xml:space="preserve"> </w:t>
+      </w:r>
+      <w:r>
+        <w:t>la rama DANIEL_ORTIZ:</w:t>
+      </w:r>
+      <w:r>
+        <w:br/>
+      </w:r>
+      <w:r>
+        <w:br/>
+      </w:r>
+      <w:proofErr w:type="spellStart"/>
+      <w:r>
         <w:t>git</w:t>
       </w:r>
       <w:proofErr w:type="spellEnd"/>
@@ -210,207 +338,2198 @@
       </w:r>
       <w:proofErr w:type="spellEnd"/>
       <w:r>
-        <w:t xml:space="preserve"> de</w:t>
-      </w:r>
+        <w:t xml:space="preserve"> --set-</w:t>
+      </w:r>
+      <w:proofErr w:type="spellStart"/>
+      <w:r>
+        <w:t>upstream</w:t>
+      </w:r>
+      <w:proofErr w:type="spellEnd"/>
       <w:r>
         <w:t xml:space="preserve"> </w:t>
       </w:r>
-      <w:r>
-        <w:t>la rama DANIEL_ORTIZ</w:t>
-      </w:r>
-      <w:r>
+      <w:proofErr w:type="spellStart"/>
+      <w:r>
+        <w:t>origin</w:t>
+      </w:r>
+      <w:proofErr w:type="spellEnd"/>
+      <w:r>
+        <w:t xml:space="preserve"> DANIEL_ORTIZ</w:t>
+      </w:r>
+    </w:p>
+    <w:p>
+      <w:r>
+        <w:t>.</w:t>
+      </w:r>
+      <w:r>
+        <w:t xml:space="preserve"> </w:t>
+      </w:r>
+      <w:proofErr w:type="spellStart"/>
+      <w:r>
+        <w:t>To</w:t>
+      </w:r>
+      <w:proofErr w:type="spellEnd"/>
+      <w:r>
+        <w:t xml:space="preserve"> https://github.com/Eduardo-L5/Curso_Miercoles_Subneteados_SEP_DIC_2025.git</w:t>
+      </w:r>
+    </w:p>
+    <w:p>
+      <w:r>
+        <w:t xml:space="preserve"> * [new </w:t>
+      </w:r>
+      <w:proofErr w:type="spellStart"/>
+      <w:r>
+        <w:t>branch</w:t>
+      </w:r>
+      <w:proofErr w:type="spellEnd"/>
+      <w:r>
+        <w:t>]      DANIEL_ORTIZ -&gt; DANIEL_ORTIZ</w:t>
+      </w:r>
+    </w:p>
+    <w:p>
+      <w:proofErr w:type="spellStart"/>
+      <w:r>
+        <w:t>branch</w:t>
+      </w:r>
+      <w:proofErr w:type="spellEnd"/>
+      <w:r>
+        <w:t xml:space="preserve"> 'DANIEL_ORTIZ' set up </w:t>
+      </w:r>
+      <w:proofErr w:type="spellStart"/>
+      <w:r>
+        <w:t>to</w:t>
+      </w:r>
+      <w:proofErr w:type="spellEnd"/>
+      <w:r>
+        <w:t xml:space="preserve"> </w:t>
+      </w:r>
+      <w:proofErr w:type="spellStart"/>
+      <w:r>
+        <w:t>track</w:t>
+      </w:r>
+      <w:proofErr w:type="spellEnd"/>
+      <w:r>
+        <w:t xml:space="preserve"> '</w:t>
+      </w:r>
+      <w:proofErr w:type="spellStart"/>
+      <w:r>
+        <w:t>origin</w:t>
+      </w:r>
+      <w:proofErr w:type="spellEnd"/>
+      <w:r>
+        <w:t>/DANIEL_ORTIZ'.</w:t>
+      </w:r>
+    </w:p>
+    <w:p>
+      <w:r>
+        <w:drawing>
+          <wp:inline distT="0" distB="0" distL="0" distR="0" wp14:anchorId="220C110D" wp14:editId="28F520CE">
+            <wp:extent cx="6691630" cy="3042285"/>
+            <wp:effectExtent l="0" t="0" r="0" b="0"/>
+            <wp:docPr id="4" name="Imagen 4"/>
+            <wp:cNvGraphicFramePr>
+              <a:graphicFrameLocks xmlns:a="http://schemas.openxmlformats.org/drawingml/2006/main" noChangeAspect="1"/>
+            </wp:cNvGraphicFramePr>
+            <a:graphic xmlns:a="http://schemas.openxmlformats.org/drawingml/2006/main">
+              <a:graphicData uri="http://schemas.openxmlformats.org/drawingml/2006/picture">
+                <pic:pic xmlns:pic="http://schemas.openxmlformats.org/drawingml/2006/picture">
+                  <pic:nvPicPr>
+                    <pic:cNvPr id="1" name=""/>
+                    <pic:cNvPicPr/>
+                  </pic:nvPicPr>
+                  <pic:blipFill>
+                    <a:blip r:embed="rId8"/>
+                    <a:stretch>
+                      <a:fillRect/>
+                    </a:stretch>
+                  </pic:blipFill>
+                  <pic:spPr>
+                    <a:xfrm>
+                      <a:off x="0" y="0"/>
+                      <a:ext cx="6691630" cy="3042285"/>
+                    </a:xfrm>
+                    <a:prstGeom prst="rect">
+                      <a:avLst/>
+                    </a:prstGeom>
+                  </pic:spPr>
+                </pic:pic>
+              </a:graphicData>
+            </a:graphic>
+          </wp:inline>
+        </w:drawing>
+      </w:r>
+    </w:p>
+    <w:p/>
+    <w:p/>
+    <w:p/>
+    <w:p/>
+    <w:p/>
+    <w:p/>
+    <w:p/>
+    <w:p/>
+    <w:p/>
+    <w:p/>
+    <w:p>
+      <w:pPr>
+        <w:rPr>
+          <w:b/>
+          <w:bCs/>
+        </w:rPr>
+      </w:pPr>
+      <w:r>
+        <w:rPr>
+          <w:b/>
+          <w:bCs/>
+        </w:rPr>
+        <w:lastRenderedPageBreak/>
+        <w:t>2) Flujo de ramas y sincronización</w:t>
+      </w:r>
+    </w:p>
+    <w:p>
+      <w:pPr>
+        <w:rPr>
+          <w:b/>
+          <w:bCs/>
+        </w:rPr>
+      </w:pPr>
+      <w:r>
+        <w:rPr>
+          <w:b/>
+          <w:bCs/>
+        </w:rPr>
+        <w:t xml:space="preserve">• Actualizar </w:t>
+      </w:r>
+      <w:proofErr w:type="spellStart"/>
+      <w:r>
+        <w:rPr>
+          <w:b/>
+          <w:bCs/>
+        </w:rPr>
+        <w:t>main</w:t>
+      </w:r>
+      <w:proofErr w:type="spellEnd"/>
+      <w:r>
+        <w:rPr>
+          <w:b/>
+          <w:bCs/>
+        </w:rPr>
+        <w:t xml:space="preserve"> con </w:t>
+      </w:r>
+      <w:proofErr w:type="spellStart"/>
+      <w:r>
+        <w:rPr>
+          <w:b/>
+          <w:bCs/>
+        </w:rPr>
+        <w:t>git</w:t>
+      </w:r>
+      <w:proofErr w:type="spellEnd"/>
+      <w:r>
+        <w:rPr>
+          <w:b/>
+          <w:bCs/>
+        </w:rPr>
+        <w:t xml:space="preserve"> </w:t>
+      </w:r>
+      <w:proofErr w:type="spellStart"/>
+      <w:r>
+        <w:rPr>
+          <w:b/>
+          <w:bCs/>
+        </w:rPr>
+        <w:t>pull</w:t>
+      </w:r>
+      <w:proofErr w:type="spellEnd"/>
+      <w:r>
+        <w:rPr>
+          <w:b/>
+          <w:bCs/>
+        </w:rPr>
+        <w:t>.</w:t>
+      </w:r>
+      <w:r>
+        <w:rPr>
+          <w:b/>
+          <w:bCs/>
+        </w:rPr>
+        <w:t xml:space="preserve"> </w:t>
+      </w:r>
+    </w:p>
+    <w:p>
+      <w:pPr>
+        <w:rPr>
+          <w:b/>
+          <w:bCs/>
+        </w:rPr>
+      </w:pPr>
+      <w:r>
+        <w:rPr>
+          <w:b/>
+          <w:bCs/>
+        </w:rPr>
+        <w:t xml:space="preserve">• Cambiar a tu rama con </w:t>
+      </w:r>
+      <w:proofErr w:type="spellStart"/>
+      <w:r>
+        <w:rPr>
+          <w:b/>
+          <w:bCs/>
+        </w:rPr>
+        <w:t>git</w:t>
+      </w:r>
+      <w:proofErr w:type="spellEnd"/>
+      <w:r>
+        <w:rPr>
+          <w:b/>
+          <w:bCs/>
+        </w:rPr>
+        <w:t xml:space="preserve"> </w:t>
+      </w:r>
+      <w:proofErr w:type="spellStart"/>
+      <w:r>
+        <w:rPr>
+          <w:b/>
+          <w:bCs/>
+        </w:rPr>
+        <w:t>checkout</w:t>
+      </w:r>
+      <w:proofErr w:type="spellEnd"/>
+      <w:r>
+        <w:rPr>
+          <w:b/>
+          <w:bCs/>
+        </w:rPr>
+        <w:t xml:space="preserve"> &lt;rama&gt; y hacer </w:t>
+      </w:r>
+      <w:proofErr w:type="spellStart"/>
+      <w:r>
+        <w:rPr>
+          <w:b/>
+          <w:bCs/>
+        </w:rPr>
+        <w:t>merge</w:t>
+      </w:r>
+      <w:proofErr w:type="spellEnd"/>
+      <w:r>
+        <w:rPr>
+          <w:b/>
+          <w:bCs/>
+        </w:rPr>
+        <w:t xml:space="preserve"> con </w:t>
+      </w:r>
+      <w:proofErr w:type="spellStart"/>
+      <w:r>
+        <w:rPr>
+          <w:b/>
+          <w:bCs/>
+        </w:rPr>
+        <w:t>main</w:t>
+      </w:r>
+      <w:proofErr w:type="spellEnd"/>
+      <w:r>
+        <w:rPr>
+          <w:b/>
+          <w:bCs/>
+        </w:rPr>
+        <w:t>.</w:t>
+      </w:r>
+      <w:r>
+        <w:rPr>
+          <w:b/>
+          <w:bCs/>
+        </w:rPr>
+        <w:t xml:space="preserve"> </w:t>
+      </w:r>
+    </w:p>
+    <w:p>
+      <w:pPr>
+        <w:rPr>
+          <w:b/>
+          <w:bCs/>
+        </w:rPr>
+      </w:pPr>
+      <w:r>
+        <w:rPr>
+          <w:b/>
+          <w:bCs/>
+        </w:rPr>
+        <w:t>• Trabajar únicamente en tu rama.</w:t>
+      </w:r>
+    </w:p>
+    <w:p>
+      <w:pPr>
+        <w:rPr>
+          <w:b/>
+          <w:bCs/>
+        </w:rPr>
+      </w:pPr>
+      <w:r>
+        <w:rPr>
+          <w:b/>
+          <w:bCs/>
+        </w:rPr>
+        <w:drawing>
+          <wp:inline distT="0" distB="0" distL="0" distR="0" wp14:anchorId="5297E09F" wp14:editId="27910F53">
+            <wp:extent cx="3534268" cy="257211"/>
+            <wp:effectExtent l="0" t="0" r="0" b="9525"/>
+            <wp:docPr id="10" name="Imagen 10"/>
+            <wp:cNvGraphicFramePr>
+              <a:graphicFrameLocks xmlns:a="http://schemas.openxmlformats.org/drawingml/2006/main" noChangeAspect="1"/>
+            </wp:cNvGraphicFramePr>
+            <a:graphic xmlns:a="http://schemas.openxmlformats.org/drawingml/2006/main">
+              <a:graphicData uri="http://schemas.openxmlformats.org/drawingml/2006/picture">
+                <pic:pic xmlns:pic="http://schemas.openxmlformats.org/drawingml/2006/picture">
+                  <pic:nvPicPr>
+                    <pic:cNvPr id="1" name=""/>
+                    <pic:cNvPicPr/>
+                  </pic:nvPicPr>
+                  <pic:blipFill>
+                    <a:blip r:embed="rId9"/>
+                    <a:stretch>
+                      <a:fillRect/>
+                    </a:stretch>
+                  </pic:blipFill>
+                  <pic:spPr>
+                    <a:xfrm>
+                      <a:off x="0" y="0"/>
+                      <a:ext cx="3534268" cy="257211"/>
+                    </a:xfrm>
+                    <a:prstGeom prst="rect">
+                      <a:avLst/>
+                    </a:prstGeom>
+                  </pic:spPr>
+                </pic:pic>
+              </a:graphicData>
+            </a:graphic>
+          </wp:inline>
+        </w:drawing>
+      </w:r>
+    </w:p>
+    <w:p>
+      <w:pPr>
+        <w:rPr>
+          <w:b/>
+          <w:bCs/>
+        </w:rPr>
+      </w:pPr>
+      <w:r>
+        <w:rPr>
+          <w:b/>
+          <w:bCs/>
+        </w:rPr>
+        <w:drawing>
+          <wp:inline distT="0" distB="0" distL="0" distR="0" wp14:anchorId="76E8E4E0" wp14:editId="5FA14D00">
+            <wp:extent cx="5477639" cy="657317"/>
+            <wp:effectExtent l="0" t="0" r="0" b="9525"/>
+            <wp:docPr id="6" name="Imagen 6"/>
+            <wp:cNvGraphicFramePr>
+              <a:graphicFrameLocks xmlns:a="http://schemas.openxmlformats.org/drawingml/2006/main" noChangeAspect="1"/>
+            </wp:cNvGraphicFramePr>
+            <a:graphic xmlns:a="http://schemas.openxmlformats.org/drawingml/2006/main">
+              <a:graphicData uri="http://schemas.openxmlformats.org/drawingml/2006/picture">
+                <pic:pic xmlns:pic="http://schemas.openxmlformats.org/drawingml/2006/picture">
+                  <pic:nvPicPr>
+                    <pic:cNvPr id="1" name=""/>
+                    <pic:cNvPicPr/>
+                  </pic:nvPicPr>
+                  <pic:blipFill>
+                    <a:blip r:embed="rId10"/>
+                    <a:stretch>
+                      <a:fillRect/>
+                    </a:stretch>
+                  </pic:blipFill>
+                  <pic:spPr>
+                    <a:xfrm>
+                      <a:off x="0" y="0"/>
+                      <a:ext cx="5477639" cy="657317"/>
+                    </a:xfrm>
+                    <a:prstGeom prst="rect">
+                      <a:avLst/>
+                    </a:prstGeom>
+                  </pic:spPr>
+                </pic:pic>
+              </a:graphicData>
+            </a:graphic>
+          </wp:inline>
+        </w:drawing>
+      </w:r>
+    </w:p>
+    <w:p>
+      <w:pPr>
+        <w:rPr>
+          <w:b/>
+          <w:bCs/>
+        </w:rPr>
+      </w:pPr>
+    </w:p>
+    <w:p>
+      <w:pPr>
+        <w:rPr>
+          <w:b/>
+          <w:bCs/>
+        </w:rPr>
+      </w:pPr>
+      <w:r>
+        <w:rPr>
+          <w:b/>
+          <w:bCs/>
+        </w:rPr>
+        <w:t>3) Crear el proyecto Angular</w:t>
+      </w:r>
+    </w:p>
+    <w:p>
+      <w:pPr>
+        <w:rPr>
+          <w:b/>
+          <w:bCs/>
+        </w:rPr>
+      </w:pPr>
+      <w:r>
+        <w:rPr>
+          <w:b/>
+          <w:bCs/>
+        </w:rPr>
+        <w:t>• Ejecutar ng new app-angular --</w:t>
+      </w:r>
+      <w:proofErr w:type="spellStart"/>
+      <w:r>
+        <w:rPr>
+          <w:b/>
+          <w:bCs/>
+        </w:rPr>
+        <w:t>routing</w:t>
+      </w:r>
+      <w:proofErr w:type="spellEnd"/>
+      <w:r>
+        <w:rPr>
+          <w:b/>
+          <w:bCs/>
+        </w:rPr>
+        <w:t xml:space="preserve"> --</w:t>
+      </w:r>
+      <w:proofErr w:type="spellStart"/>
+      <w:r>
+        <w:rPr>
+          <w:b/>
+          <w:bCs/>
+        </w:rPr>
+        <w:t>style</w:t>
+      </w:r>
+      <w:proofErr w:type="spellEnd"/>
+      <w:r>
+        <w:rPr>
+          <w:b/>
+          <w:bCs/>
+        </w:rPr>
+        <w:t>=</w:t>
+      </w:r>
+      <w:proofErr w:type="spellStart"/>
+      <w:r>
+        <w:rPr>
+          <w:b/>
+          <w:bCs/>
+        </w:rPr>
+        <w:t>scss</w:t>
+      </w:r>
+      <w:proofErr w:type="spellEnd"/>
+      <w:r>
+        <w:rPr>
+          <w:b/>
+          <w:bCs/>
+        </w:rPr>
+        <w:t>.</w:t>
+      </w:r>
+    </w:p>
+    <w:p>
+      <w:r>
+        <w:drawing>
+          <wp:inline distT="0" distB="0" distL="0" distR="0" wp14:anchorId="1F7E7194" wp14:editId="36BF402D">
+            <wp:extent cx="6691630" cy="4025265"/>
+            <wp:effectExtent l="0" t="0" r="0" b="0"/>
+            <wp:docPr id="5" name="Imagen 5"/>
+            <wp:cNvGraphicFramePr>
+              <a:graphicFrameLocks xmlns:a="http://schemas.openxmlformats.org/drawingml/2006/main" noChangeAspect="1"/>
+            </wp:cNvGraphicFramePr>
+            <a:graphic xmlns:a="http://schemas.openxmlformats.org/drawingml/2006/main">
+              <a:graphicData uri="http://schemas.openxmlformats.org/drawingml/2006/picture">
+                <pic:pic xmlns:pic="http://schemas.openxmlformats.org/drawingml/2006/picture">
+                  <pic:nvPicPr>
+                    <pic:cNvPr id="1" name=""/>
+                    <pic:cNvPicPr/>
+                  </pic:nvPicPr>
+                  <pic:blipFill>
+                    <a:blip r:embed="rId11"/>
+                    <a:stretch>
+                      <a:fillRect/>
+                    </a:stretch>
+                  </pic:blipFill>
+                  <pic:spPr>
+                    <a:xfrm>
+                      <a:off x="0" y="0"/>
+                      <a:ext cx="6691630" cy="4025265"/>
+                    </a:xfrm>
+                    <a:prstGeom prst="rect">
+                      <a:avLst/>
+                    </a:prstGeom>
+                  </pic:spPr>
+                </pic:pic>
+              </a:graphicData>
+            </a:graphic>
+          </wp:inline>
+        </w:drawing>
+      </w:r>
+    </w:p>
+    <w:p/>
+    <w:p/>
+    <w:p/>
+    <w:p/>
+    <w:p/>
+    <w:p/>
+    <w:p/>
+    <w:p>
+      <w:pPr>
+        <w:rPr>
+          <w:b/>
+          <w:bCs/>
+        </w:rPr>
+      </w:pPr>
+      <w:r>
+        <w:rPr>
+          <w:b/>
+          <w:bCs/>
+        </w:rPr>
+        <w:t>Entrar a la carpeta y correr ng serve -o.</w:t>
+      </w:r>
+    </w:p>
+    <w:p>
+      <w:r>
+        <w:drawing>
+          <wp:inline distT="0" distB="0" distL="0" distR="0" wp14:anchorId="664D617F" wp14:editId="41A242CB">
+            <wp:extent cx="5944430" cy="3543795"/>
+            <wp:effectExtent l="0" t="0" r="0" b="0"/>
+            <wp:docPr id="7" name="Imagen 7"/>
+            <wp:cNvGraphicFramePr>
+              <a:graphicFrameLocks xmlns:a="http://schemas.openxmlformats.org/drawingml/2006/main" noChangeAspect="1"/>
+            </wp:cNvGraphicFramePr>
+            <a:graphic xmlns:a="http://schemas.openxmlformats.org/drawingml/2006/main">
+              <a:graphicData uri="http://schemas.openxmlformats.org/drawingml/2006/picture">
+                <pic:pic xmlns:pic="http://schemas.openxmlformats.org/drawingml/2006/picture">
+                  <pic:nvPicPr>
+                    <pic:cNvPr id="1" name=""/>
+                    <pic:cNvPicPr/>
+                  </pic:nvPicPr>
+                  <pic:blipFill>
+                    <a:blip r:embed="rId12"/>
+                    <a:stretch>
+                      <a:fillRect/>
+                    </a:stretch>
+                  </pic:blipFill>
+                  <pic:spPr>
+                    <a:xfrm>
+                      <a:off x="0" y="0"/>
+                      <a:ext cx="5944430" cy="3543795"/>
+                    </a:xfrm>
+                    <a:prstGeom prst="rect">
+                      <a:avLst/>
+                    </a:prstGeom>
+                  </pic:spPr>
+                </pic:pic>
+              </a:graphicData>
+            </a:graphic>
+          </wp:inline>
+        </w:drawing>
+      </w:r>
+    </w:p>
+    <w:p>
+      <w:r>
+        <w:drawing>
+          <wp:inline distT="0" distB="0" distL="0" distR="0" wp14:anchorId="3F21BC1D" wp14:editId="0C3A7C48">
+            <wp:extent cx="5134692" cy="1943371"/>
+            <wp:effectExtent l="0" t="0" r="8890" b="0"/>
+            <wp:docPr id="8" name="Imagen 8"/>
+            <wp:cNvGraphicFramePr>
+              <a:graphicFrameLocks xmlns:a="http://schemas.openxmlformats.org/drawingml/2006/main" noChangeAspect="1"/>
+            </wp:cNvGraphicFramePr>
+            <a:graphic xmlns:a="http://schemas.openxmlformats.org/drawingml/2006/main">
+              <a:graphicData uri="http://schemas.openxmlformats.org/drawingml/2006/picture">
+                <pic:pic xmlns:pic="http://schemas.openxmlformats.org/drawingml/2006/picture">
+                  <pic:nvPicPr>
+                    <pic:cNvPr id="1" name=""/>
+                    <pic:cNvPicPr/>
+                  </pic:nvPicPr>
+                  <pic:blipFill>
+                    <a:blip r:embed="rId13"/>
+                    <a:stretch>
+                      <a:fillRect/>
+                    </a:stretch>
+                  </pic:blipFill>
+                  <pic:spPr>
+                    <a:xfrm>
+                      <a:off x="0" y="0"/>
+                      <a:ext cx="5134692" cy="1943371"/>
+                    </a:xfrm>
+                    <a:prstGeom prst="rect">
+                      <a:avLst/>
+                    </a:prstGeom>
+                  </pic:spPr>
+                </pic:pic>
+              </a:graphicData>
+            </a:graphic>
+          </wp:inline>
+        </w:drawing>
+      </w:r>
+    </w:p>
+    <w:p/>
+    <w:p/>
+    <w:p>
+      <w:r>
+        <w:lastRenderedPageBreak/>
+        <w:drawing>
+          <wp:inline distT="0" distB="0" distL="0" distR="0" wp14:anchorId="6E5A3960" wp14:editId="24575EF4">
+            <wp:extent cx="6691630" cy="2264410"/>
+            <wp:effectExtent l="0" t="0" r="0" b="0"/>
+            <wp:docPr id="9" name="Imagen 9"/>
+            <wp:cNvGraphicFramePr>
+              <a:graphicFrameLocks xmlns:a="http://schemas.openxmlformats.org/drawingml/2006/main" noChangeAspect="1"/>
+            </wp:cNvGraphicFramePr>
+            <a:graphic xmlns:a="http://schemas.openxmlformats.org/drawingml/2006/main">
+              <a:graphicData uri="http://schemas.openxmlformats.org/drawingml/2006/picture">
+                <pic:pic xmlns:pic="http://schemas.openxmlformats.org/drawingml/2006/picture">
+                  <pic:nvPicPr>
+                    <pic:cNvPr id="1" name=""/>
+                    <pic:cNvPicPr/>
+                  </pic:nvPicPr>
+                  <pic:blipFill>
+                    <a:blip r:embed="rId14"/>
+                    <a:stretch>
+                      <a:fillRect/>
+                    </a:stretch>
+                  </pic:blipFill>
+                  <pic:spPr>
+                    <a:xfrm>
+                      <a:off x="0" y="0"/>
+                      <a:ext cx="6691630" cy="2264410"/>
+                    </a:xfrm>
+                    <a:prstGeom prst="rect">
+                      <a:avLst/>
+                    </a:prstGeom>
+                  </pic:spPr>
+                </pic:pic>
+              </a:graphicData>
+            </a:graphic>
+          </wp:inline>
+        </w:drawing>
+      </w:r>
+    </w:p>
+    <w:p>
+      <w:pPr>
+        <w:rPr>
+          <w:b/>
+          <w:bCs/>
+        </w:rPr>
+      </w:pPr>
+      <w:r>
+        <w:rPr>
+          <w:b/>
+          <w:bCs/>
+        </w:rPr>
+        <w:t>4) Migración HTML/CSS/JS</w:t>
+      </w:r>
+    </w:p>
+    <w:p>
+      <w:pPr>
+        <w:rPr>
+          <w:b/>
+          <w:bCs/>
+        </w:rPr>
+      </w:pPr>
+      <w:r>
+        <w:rPr>
+          <w:b/>
+          <w:bCs/>
+        </w:rPr>
+        <w:t>• Dividir el HTML en componentes.</w:t>
+      </w:r>
+    </w:p>
+    <w:p>
+      <w:pPr>
+        <w:rPr>
+          <w:b/>
+          <w:bCs/>
+        </w:rPr>
+      </w:pPr>
+      <w:r>
+        <w:rPr>
+          <w:b/>
+          <w:bCs/>
+        </w:rPr>
+        <w:drawing>
+          <wp:inline distT="0" distB="0" distL="0" distR="0" wp14:anchorId="5A372905" wp14:editId="59723AE5">
+            <wp:extent cx="6691630" cy="2298065"/>
+            <wp:effectExtent l="0" t="0" r="0" b="0"/>
+            <wp:docPr id="11" name="Imagen 11"/>
+            <wp:cNvGraphicFramePr>
+              <a:graphicFrameLocks xmlns:a="http://schemas.openxmlformats.org/drawingml/2006/main" noChangeAspect="1"/>
+            </wp:cNvGraphicFramePr>
+            <a:graphic xmlns:a="http://schemas.openxmlformats.org/drawingml/2006/main">
+              <a:graphicData uri="http://schemas.openxmlformats.org/drawingml/2006/picture">
+                <pic:pic xmlns:pic="http://schemas.openxmlformats.org/drawingml/2006/picture">
+                  <pic:nvPicPr>
+                    <pic:cNvPr id="1" name=""/>
+                    <pic:cNvPicPr/>
+                  </pic:nvPicPr>
+                  <pic:blipFill>
+                    <a:blip r:embed="rId15"/>
+                    <a:stretch>
+                      <a:fillRect/>
+                    </a:stretch>
+                  </pic:blipFill>
+                  <pic:spPr>
+                    <a:xfrm>
+                      <a:off x="0" y="0"/>
+                      <a:ext cx="6691630" cy="2298065"/>
+                    </a:xfrm>
+                    <a:prstGeom prst="rect">
+                      <a:avLst/>
+                    </a:prstGeom>
+                  </pic:spPr>
+                </pic:pic>
+              </a:graphicData>
+            </a:graphic>
+          </wp:inline>
+        </w:drawing>
+      </w:r>
+    </w:p>
+    <w:p>
+      <w:pPr>
+        <w:rPr>
+          <w:b/>
+          <w:bCs/>
+        </w:rPr>
+      </w:pPr>
+      <w:r>
+        <w:rPr>
+          <w:b/>
+          <w:bCs/>
+        </w:rPr>
+        <w:drawing>
+          <wp:inline distT="0" distB="0" distL="0" distR="0" wp14:anchorId="2A5D2DCF" wp14:editId="53B32F58">
+            <wp:extent cx="4182059" cy="1381318"/>
+            <wp:effectExtent l="0" t="0" r="9525" b="9525"/>
+            <wp:docPr id="13" name="Imagen 13"/>
+            <wp:cNvGraphicFramePr>
+              <a:graphicFrameLocks xmlns:a="http://schemas.openxmlformats.org/drawingml/2006/main" noChangeAspect="1"/>
+            </wp:cNvGraphicFramePr>
+            <a:graphic xmlns:a="http://schemas.openxmlformats.org/drawingml/2006/main">
+              <a:graphicData uri="http://schemas.openxmlformats.org/drawingml/2006/picture">
+                <pic:pic xmlns:pic="http://schemas.openxmlformats.org/drawingml/2006/picture">
+                  <pic:nvPicPr>
+                    <pic:cNvPr id="1" name=""/>
+                    <pic:cNvPicPr/>
+                  </pic:nvPicPr>
+                  <pic:blipFill>
+                    <a:blip r:embed="rId16"/>
+                    <a:stretch>
+                      <a:fillRect/>
+                    </a:stretch>
+                  </pic:blipFill>
+                  <pic:spPr>
+                    <a:xfrm>
+                      <a:off x="0" y="0"/>
+                      <a:ext cx="4182059" cy="1381318"/>
+                    </a:xfrm>
+                    <a:prstGeom prst="rect">
+                      <a:avLst/>
+                    </a:prstGeom>
+                  </pic:spPr>
+                </pic:pic>
+              </a:graphicData>
+            </a:graphic>
+          </wp:inline>
+        </w:drawing>
+      </w:r>
+    </w:p>
+    <w:p>
+      <w:pPr>
+        <w:rPr>
+          <w:b/>
+          <w:bCs/>
+        </w:rPr>
+      </w:pPr>
+      <w:r>
+        <w:rPr>
+          <w:b/>
+          <w:bCs/>
+        </w:rPr>
+        <w:drawing>
+          <wp:inline distT="0" distB="0" distL="0" distR="0" wp14:anchorId="5DB5E911" wp14:editId="26BB2624">
+            <wp:extent cx="3581900" cy="1371791"/>
+            <wp:effectExtent l="0" t="0" r="0" b="0"/>
+            <wp:docPr id="15" name="Imagen 15"/>
+            <wp:cNvGraphicFramePr>
+              <a:graphicFrameLocks xmlns:a="http://schemas.openxmlformats.org/drawingml/2006/main" noChangeAspect="1"/>
+            </wp:cNvGraphicFramePr>
+            <a:graphic xmlns:a="http://schemas.openxmlformats.org/drawingml/2006/main">
+              <a:graphicData uri="http://schemas.openxmlformats.org/drawingml/2006/picture">
+                <pic:pic xmlns:pic="http://schemas.openxmlformats.org/drawingml/2006/picture">
+                  <pic:nvPicPr>
+                    <pic:cNvPr id="1" name=""/>
+                    <pic:cNvPicPr/>
+                  </pic:nvPicPr>
+                  <pic:blipFill>
+                    <a:blip r:embed="rId17"/>
+                    <a:stretch>
+                      <a:fillRect/>
+                    </a:stretch>
+                  </pic:blipFill>
+                  <pic:spPr>
+                    <a:xfrm>
+                      <a:off x="0" y="0"/>
+                      <a:ext cx="3581900" cy="1371791"/>
+                    </a:xfrm>
+                    <a:prstGeom prst="rect">
+                      <a:avLst/>
+                    </a:prstGeom>
+                  </pic:spPr>
+                </pic:pic>
+              </a:graphicData>
+            </a:graphic>
+          </wp:inline>
+        </w:drawing>
+      </w:r>
+    </w:p>
+    <w:p>
+      <w:pPr>
+        <w:rPr>
+          <w:b/>
+          <w:bCs/>
+        </w:rPr>
+      </w:pPr>
+      <w:r>
+        <w:rPr>
+          <w:b/>
+          <w:bCs/>
+        </w:rPr>
+        <w:lastRenderedPageBreak/>
+        <w:drawing>
+          <wp:inline distT="0" distB="0" distL="0" distR="0" wp14:anchorId="7418D993" wp14:editId="785FD94E">
+            <wp:extent cx="4048690" cy="1971950"/>
+            <wp:effectExtent l="0" t="0" r="9525" b="9525"/>
+            <wp:docPr id="16" name="Imagen 16"/>
+            <wp:cNvGraphicFramePr>
+              <a:graphicFrameLocks xmlns:a="http://schemas.openxmlformats.org/drawingml/2006/main" noChangeAspect="1"/>
+            </wp:cNvGraphicFramePr>
+            <a:graphic xmlns:a="http://schemas.openxmlformats.org/drawingml/2006/main">
+              <a:graphicData uri="http://schemas.openxmlformats.org/drawingml/2006/picture">
+                <pic:pic xmlns:pic="http://schemas.openxmlformats.org/drawingml/2006/picture">
+                  <pic:nvPicPr>
+                    <pic:cNvPr id="1" name=""/>
+                    <pic:cNvPicPr/>
+                  </pic:nvPicPr>
+                  <pic:blipFill>
+                    <a:blip r:embed="rId18"/>
+                    <a:stretch>
+                      <a:fillRect/>
+                    </a:stretch>
+                  </pic:blipFill>
+                  <pic:spPr>
+                    <a:xfrm>
+                      <a:off x="0" y="0"/>
+                      <a:ext cx="4048690" cy="1971950"/>
+                    </a:xfrm>
+                    <a:prstGeom prst="rect">
+                      <a:avLst/>
+                    </a:prstGeom>
+                  </pic:spPr>
+                </pic:pic>
+              </a:graphicData>
+            </a:graphic>
+          </wp:inline>
+        </w:drawing>
+      </w:r>
+    </w:p>
+    <w:p>
+      <w:pPr>
+        <w:rPr>
+          <w:b/>
+          <w:bCs/>
+        </w:rPr>
+      </w:pPr>
+      <w:r>
+        <w:rPr>
+          <w:b/>
+          <w:bCs/>
+        </w:rPr>
+        <w:t>• Migrar CSS a SCSS y organizar en estilos globales vs. por componente.</w:t>
+      </w:r>
+      <w:r>
+        <w:rPr>
+          <w:b/>
+          <w:bCs/>
+        </w:rPr>
+        <w:br/>
+      </w:r>
+      <w:r>
+        <w:rPr>
+          <w:b/>
+          <w:bCs/>
+        </w:rPr>
+        <w:br/>
+      </w:r>
+      <w:r>
+        <w:rPr>
+          <w:b/>
+          <w:bCs/>
+        </w:rPr>
+        <w:t>Cambiar el proyecto de CSS a SCSS</w:t>
+      </w:r>
+    </w:p>
+    <w:p>
+      <w:pPr>
+        <w:rPr>
+          <w:b/>
+          <w:bCs/>
+        </w:rPr>
+      </w:pPr>
+      <w:r>
+        <w:rPr>
+          <w:b/>
+          <w:bCs/>
+        </w:rPr>
+        <w:drawing>
+          <wp:inline distT="0" distB="0" distL="0" distR="0" wp14:anchorId="02C94D6B" wp14:editId="1AC9EE66">
+            <wp:extent cx="6691630" cy="121285"/>
+            <wp:effectExtent l="0" t="0" r="0" b="0"/>
+            <wp:docPr id="17" name="Imagen 17"/>
+            <wp:cNvGraphicFramePr>
+              <a:graphicFrameLocks xmlns:a="http://schemas.openxmlformats.org/drawingml/2006/main" noChangeAspect="1"/>
+            </wp:cNvGraphicFramePr>
+            <a:graphic xmlns:a="http://schemas.openxmlformats.org/drawingml/2006/main">
+              <a:graphicData uri="http://schemas.openxmlformats.org/drawingml/2006/picture">
+                <pic:pic xmlns:pic="http://schemas.openxmlformats.org/drawingml/2006/picture">
+                  <pic:nvPicPr>
+                    <pic:cNvPr id="1" name=""/>
+                    <pic:cNvPicPr/>
+                  </pic:nvPicPr>
+                  <pic:blipFill>
+                    <a:blip r:embed="rId19"/>
+                    <a:stretch>
+                      <a:fillRect/>
+                    </a:stretch>
+                  </pic:blipFill>
+                  <pic:spPr>
+                    <a:xfrm>
+                      <a:off x="0" y="0"/>
+                      <a:ext cx="6691630" cy="121285"/>
+                    </a:xfrm>
+                    <a:prstGeom prst="rect">
+                      <a:avLst/>
+                    </a:prstGeom>
+                  </pic:spPr>
+                </pic:pic>
+              </a:graphicData>
+            </a:graphic>
+          </wp:inline>
+        </w:drawing>
+      </w:r>
+      <w:r>
+        <w:rPr>
+          <w:b/>
+          <w:bCs/>
+        </w:rPr>
+        <w:br/>
+      </w:r>
+    </w:p>
+    <w:p>
+      <w:pPr>
+        <w:rPr>
+          <w:b/>
+          <w:bCs/>
+        </w:rPr>
+      </w:pPr>
+      <w:proofErr w:type="spellStart"/>
+      <w:r>
+        <w:rPr>
+          <w:b/>
+          <w:bCs/>
+        </w:rPr>
+        <w:t>src</w:t>
+      </w:r>
+      <w:proofErr w:type="spellEnd"/>
+      <w:r>
+        <w:rPr>
+          <w:b/>
+          <w:bCs/>
+        </w:rPr>
+        <w:t xml:space="preserve">/styles.css a </w:t>
+      </w:r>
+      <w:proofErr w:type="spellStart"/>
+      <w:r>
+        <w:rPr>
+          <w:b/>
+          <w:bCs/>
+        </w:rPr>
+        <w:t>src</w:t>
+      </w:r>
+      <w:proofErr w:type="spellEnd"/>
+      <w:r>
+        <w:rPr>
+          <w:b/>
+          <w:bCs/>
+        </w:rPr>
+        <w:t>/</w:t>
+      </w:r>
+      <w:proofErr w:type="spellStart"/>
+      <w:r>
+        <w:rPr>
+          <w:b/>
+          <w:bCs/>
+        </w:rPr>
+        <w:t>styles.scss</w:t>
+      </w:r>
+      <w:proofErr w:type="spellEnd"/>
+      <w:r>
+        <w:rPr>
+          <w:b/>
+          <w:bCs/>
+        </w:rPr>
         <w:t>:</w:t>
       </w:r>
       <w:r>
+        <w:rPr>
+          <w:b/>
+          <w:bCs/>
+        </w:rPr>
         <w:br/>
       </w:r>
       <w:r>
+        <w:rPr>
+          <w:b/>
+          <w:bCs/>
+        </w:rPr>
+        <w:drawing>
+          <wp:inline distT="0" distB="0" distL="0" distR="0" wp14:anchorId="402E7B23" wp14:editId="5236B605">
+            <wp:extent cx="2324424" cy="2095792"/>
+            <wp:effectExtent l="0" t="0" r="0" b="0"/>
+            <wp:docPr id="18" name="Imagen 18"/>
+            <wp:cNvGraphicFramePr>
+              <a:graphicFrameLocks xmlns:a="http://schemas.openxmlformats.org/drawingml/2006/main" noChangeAspect="1"/>
+            </wp:cNvGraphicFramePr>
+            <a:graphic xmlns:a="http://schemas.openxmlformats.org/drawingml/2006/main">
+              <a:graphicData uri="http://schemas.openxmlformats.org/drawingml/2006/picture">
+                <pic:pic xmlns:pic="http://schemas.openxmlformats.org/drawingml/2006/picture">
+                  <pic:nvPicPr>
+                    <pic:cNvPr id="1" name=""/>
+                    <pic:cNvPicPr/>
+                  </pic:nvPicPr>
+                  <pic:blipFill>
+                    <a:blip r:embed="rId20"/>
+                    <a:stretch>
+                      <a:fillRect/>
+                    </a:stretch>
+                  </pic:blipFill>
+                  <pic:spPr>
+                    <a:xfrm>
+                      <a:off x="0" y="0"/>
+                      <a:ext cx="2324424" cy="2095792"/>
+                    </a:xfrm>
+                    <a:prstGeom prst="rect">
+                      <a:avLst/>
+                    </a:prstGeom>
+                  </pic:spPr>
+                </pic:pic>
+              </a:graphicData>
+            </a:graphic>
+          </wp:inline>
+        </w:drawing>
+      </w:r>
+      <w:r>
+        <w:rPr>
+          <w:b/>
+          <w:bCs/>
+        </w:rPr>
         <w:br/>
       </w:r>
-      <w:proofErr w:type="spellStart"/>
-      <w:r>
-        <w:t>git</w:t>
-      </w:r>
-      <w:proofErr w:type="spellEnd"/>
-      <w:r>
+    </w:p>
+    <w:p>
+      <w:pPr>
+        <w:rPr>
+          <w:b/>
+          <w:bCs/>
+        </w:rPr>
+      </w:pPr>
+      <w:r>
+        <w:rPr>
+          <w:b/>
+          <w:bCs/>
+        </w:rPr>
+        <w:t>"</w:t>
+      </w:r>
+      <w:proofErr w:type="spellStart"/>
+      <w:r>
+        <w:rPr>
+          <w:b/>
+          <w:bCs/>
+        </w:rPr>
+        <w:t>styles</w:t>
+      </w:r>
+      <w:proofErr w:type="spellEnd"/>
+      <w:r>
+        <w:rPr>
+          <w:b/>
+          <w:bCs/>
+        </w:rPr>
+        <w:t>": [</w:t>
+      </w:r>
+    </w:p>
+    <w:p>
+      <w:pPr>
+        <w:rPr>
+          <w:b/>
+          <w:bCs/>
+        </w:rPr>
+      </w:pPr>
+      <w:r>
+        <w:rPr>
+          <w:b/>
+          <w:bCs/>
+        </w:rPr>
+        <w:t xml:space="preserve">Actualización </w:t>
+      </w:r>
+      <w:proofErr w:type="spellStart"/>
+      <w:r>
+        <w:rPr>
+          <w:b/>
+          <w:bCs/>
+        </w:rPr>
+        <w:t>angular.json</w:t>
+      </w:r>
+      <w:proofErr w:type="spellEnd"/>
+      <w:r>
+        <w:rPr>
+          <w:b/>
+          <w:bCs/>
+        </w:rPr>
+        <w:t xml:space="preserve"> para que use SCSS</w:t>
+      </w:r>
+      <w:r>
+        <w:rPr>
+          <w:b/>
+          <w:bCs/>
+        </w:rPr>
+        <w:br/>
+      </w:r>
+      <w:r>
+        <w:rPr>
+          <w:b/>
+          <w:bCs/>
+        </w:rPr>
+        <w:drawing>
+          <wp:inline distT="0" distB="0" distL="0" distR="0" wp14:anchorId="514ED322" wp14:editId="5806AA59">
+            <wp:extent cx="2734057" cy="1695687"/>
+            <wp:effectExtent l="0" t="0" r="9525" b="0"/>
+            <wp:docPr id="19" name="Imagen 19"/>
+            <wp:cNvGraphicFramePr>
+              <a:graphicFrameLocks xmlns:a="http://schemas.openxmlformats.org/drawingml/2006/main" noChangeAspect="1"/>
+            </wp:cNvGraphicFramePr>
+            <a:graphic xmlns:a="http://schemas.openxmlformats.org/drawingml/2006/main">
+              <a:graphicData uri="http://schemas.openxmlformats.org/drawingml/2006/picture">
+                <pic:pic xmlns:pic="http://schemas.openxmlformats.org/drawingml/2006/picture">
+                  <pic:nvPicPr>
+                    <pic:cNvPr id="1" name=""/>
+                    <pic:cNvPicPr/>
+                  </pic:nvPicPr>
+                  <pic:blipFill>
+                    <a:blip r:embed="rId21"/>
+                    <a:stretch>
+                      <a:fillRect/>
+                    </a:stretch>
+                  </pic:blipFill>
+                  <pic:spPr>
+                    <a:xfrm>
+                      <a:off x="0" y="0"/>
+                      <a:ext cx="2734057" cy="1695687"/>
+                    </a:xfrm>
+                    <a:prstGeom prst="rect">
+                      <a:avLst/>
+                    </a:prstGeom>
+                  </pic:spPr>
+                </pic:pic>
+              </a:graphicData>
+            </a:graphic>
+          </wp:inline>
+        </w:drawing>
+      </w:r>
+    </w:p>
+    <w:p>
+      <w:pPr>
+        <w:rPr>
+          <w:b/>
+          <w:bCs/>
+        </w:rPr>
+      </w:pPr>
+    </w:p>
+    <w:p>
+      <w:pPr>
+        <w:rPr>
+          <w:b/>
+          <w:bCs/>
+        </w:rPr>
+      </w:pPr>
+    </w:p>
+    <w:p>
+      <w:pPr>
+        <w:rPr>
+          <w:b/>
+          <w:bCs/>
+        </w:rPr>
+      </w:pPr>
+    </w:p>
+    <w:p>
+      <w:pPr>
+        <w:rPr>
+          <w:b/>
+          <w:bCs/>
+        </w:rPr>
+      </w:pPr>
+      <w:proofErr w:type="spellStart"/>
+      <w:r>
+        <w:rPr>
+          <w:b/>
+          <w:bCs/>
+        </w:rPr>
+        <w:lastRenderedPageBreak/>
+        <w:t>src</w:t>
+      </w:r>
+      <w:proofErr w:type="spellEnd"/>
+      <w:r>
+        <w:rPr>
+          <w:b/>
+          <w:bCs/>
+        </w:rPr>
+        <w:t>/</w:t>
+      </w:r>
+      <w:proofErr w:type="spellStart"/>
+      <w:r>
+        <w:rPr>
+          <w:b/>
+          <w:bCs/>
+        </w:rPr>
+        <w:t>styles.scss</w:t>
+      </w:r>
+      <w:proofErr w:type="spellEnd"/>
+      <w:r>
+        <w:rPr>
+          <w:b/>
+          <w:bCs/>
+        </w:rPr>
+        <w:t xml:space="preserve"> van los estilos que se aplican a toda la aplicación,</w:t>
+      </w:r>
+    </w:p>
+    <w:p>
+      <w:pPr>
+        <w:rPr>
+          <w:b/>
+          <w:bCs/>
+        </w:rPr>
+      </w:pPr>
+      <w:r>
+        <w:rPr>
+          <w:b/>
+          <w:bCs/>
+        </w:rPr>
+        <w:drawing>
+          <wp:inline distT="0" distB="0" distL="0" distR="0" wp14:anchorId="526CCEF1" wp14:editId="334BE5E4">
+            <wp:extent cx="2772162" cy="2267266"/>
+            <wp:effectExtent l="0" t="0" r="9525" b="0"/>
+            <wp:docPr id="20" name="Imagen 20"/>
+            <wp:cNvGraphicFramePr>
+              <a:graphicFrameLocks xmlns:a="http://schemas.openxmlformats.org/drawingml/2006/main" noChangeAspect="1"/>
+            </wp:cNvGraphicFramePr>
+            <a:graphic xmlns:a="http://schemas.openxmlformats.org/drawingml/2006/main">
+              <a:graphicData uri="http://schemas.openxmlformats.org/drawingml/2006/picture">
+                <pic:pic xmlns:pic="http://schemas.openxmlformats.org/drawingml/2006/picture">
+                  <pic:nvPicPr>
+                    <pic:cNvPr id="1" name=""/>
+                    <pic:cNvPicPr/>
+                  </pic:nvPicPr>
+                  <pic:blipFill>
+                    <a:blip r:embed="rId22"/>
+                    <a:stretch>
+                      <a:fillRect/>
+                    </a:stretch>
+                  </pic:blipFill>
+                  <pic:spPr>
+                    <a:xfrm>
+                      <a:off x="0" y="0"/>
+                      <a:ext cx="2772162" cy="2267266"/>
+                    </a:xfrm>
+                    <a:prstGeom prst="rect">
+                      <a:avLst/>
+                    </a:prstGeom>
+                  </pic:spPr>
+                </pic:pic>
+              </a:graphicData>
+            </a:graphic>
+          </wp:inline>
+        </w:drawing>
+      </w:r>
+    </w:p>
+    <w:p>
+      <w:pPr>
+        <w:rPr>
+          <w:b/>
+          <w:bCs/>
+        </w:rPr>
+      </w:pPr>
+    </w:p>
+    <w:p>
+      <w:pPr>
+        <w:rPr>
+          <w:b/>
+          <w:bCs/>
+        </w:rPr>
+      </w:pPr>
+      <w:proofErr w:type="spellStart"/>
+      <w:r>
+        <w:rPr>
+          <w:b/>
+          <w:bCs/>
+        </w:rPr>
+        <w:t>header.component.scss</w:t>
+      </w:r>
+      <w:proofErr w:type="spellEnd"/>
+      <w:r>
+        <w:rPr>
+          <w:b/>
+          <w:bCs/>
+        </w:rPr>
         <w:t xml:space="preserve"> </w:t>
       </w:r>
-      <w:proofErr w:type="spellStart"/>
-      <w:r>
-        <w:t>push</w:t>
-      </w:r>
-      <w:proofErr w:type="spellEnd"/>
-      <w:r>
-        <w:t xml:space="preserve"> --set-</w:t>
-      </w:r>
-      <w:proofErr w:type="spellStart"/>
-      <w:r>
-        <w:t>upstream</w:t>
-      </w:r>
-      <w:proofErr w:type="spellEnd"/>
-      <w:r>
+      <w:r>
+        <w:rPr>
+          <w:b/>
+          <w:bCs/>
+        </w:rPr>
+        <w:t>van los estilos que se aplican a</w:t>
+      </w:r>
+      <w:r>
+        <w:rPr>
+          <w:b/>
+          <w:bCs/>
+        </w:rPr>
         <w:t xml:space="preserve"> </w:t>
       </w:r>
       <w:proofErr w:type="spellStart"/>
       <w:r>
-        <w:t>origin</w:t>
-      </w:r>
-      <w:proofErr w:type="spellEnd"/>
-      <w:r>
-        <w:t xml:space="preserve"> DANIEL_ORTIZ</w:t>
-      </w:r>
-    </w:p>
-    <w:p>
+        <w:rPr>
+          <w:b/>
+          <w:bCs/>
+        </w:rPr>
+        <w:t>header</w:t>
+      </w:r>
+      <w:proofErr w:type="spellEnd"/>
+    </w:p>
+    <w:p>
+      <w:pPr>
+        <w:rPr>
+          <w:b/>
+          <w:bCs/>
+        </w:rPr>
+      </w:pPr>
+      <w:r>
+        <w:rPr>
+          <w:b/>
+          <w:bCs/>
+        </w:rPr>
+        <w:drawing>
+          <wp:inline distT="0" distB="0" distL="0" distR="0" wp14:anchorId="5ED11E8E" wp14:editId="178E0D6C">
+            <wp:extent cx="3324689" cy="2295845"/>
+            <wp:effectExtent l="0" t="0" r="9525" b="9525"/>
+            <wp:docPr id="21" name="Imagen 21"/>
+            <wp:cNvGraphicFramePr>
+              <a:graphicFrameLocks xmlns:a="http://schemas.openxmlformats.org/drawingml/2006/main" noChangeAspect="1"/>
+            </wp:cNvGraphicFramePr>
+            <a:graphic xmlns:a="http://schemas.openxmlformats.org/drawingml/2006/main">
+              <a:graphicData uri="http://schemas.openxmlformats.org/drawingml/2006/picture">
+                <pic:pic xmlns:pic="http://schemas.openxmlformats.org/drawingml/2006/picture">
+                  <pic:nvPicPr>
+                    <pic:cNvPr id="1" name=""/>
+                    <pic:cNvPicPr/>
+                  </pic:nvPicPr>
+                  <pic:blipFill>
+                    <a:blip r:embed="rId23"/>
+                    <a:stretch>
+                      <a:fillRect/>
+                    </a:stretch>
+                  </pic:blipFill>
+                  <pic:spPr>
+                    <a:xfrm>
+                      <a:off x="0" y="0"/>
+                      <a:ext cx="3324689" cy="2295845"/>
+                    </a:xfrm>
+                    <a:prstGeom prst="rect">
+                      <a:avLst/>
+                    </a:prstGeom>
+                  </pic:spPr>
+                </pic:pic>
+              </a:graphicData>
+            </a:graphic>
+          </wp:inline>
+        </w:drawing>
+      </w:r>
+    </w:p>
+    <w:p>
+      <w:pPr>
+        <w:rPr>
+          <w:b/>
+          <w:bCs/>
+        </w:rPr>
+      </w:pPr>
+    </w:p>
+    <w:p>
+      <w:pPr>
+        <w:rPr>
+          <w:b/>
+          <w:bCs/>
+        </w:rPr>
+      </w:pPr>
+    </w:p>
+    <w:p>
+      <w:pPr>
+        <w:rPr>
+          <w:b/>
+          <w:bCs/>
+        </w:rPr>
+      </w:pPr>
+    </w:p>
+    <w:p>
+      <w:pPr>
+        <w:rPr>
+          <w:b/>
+          <w:bCs/>
+        </w:rPr>
+      </w:pPr>
+    </w:p>
+    <w:p>
+      <w:pPr>
+        <w:rPr>
+          <w:b/>
+          <w:bCs/>
+        </w:rPr>
+      </w:pPr>
+    </w:p>
+    <w:p>
+      <w:pPr>
+        <w:rPr>
+          <w:b/>
+          <w:bCs/>
+        </w:rPr>
+      </w:pPr>
+    </w:p>
+    <w:p>
+      <w:pPr>
+        <w:rPr>
+          <w:b/>
+          <w:bCs/>
+        </w:rPr>
+      </w:pPr>
+    </w:p>
+    <w:p>
+      <w:pPr>
+        <w:rPr>
+          <w:b/>
+          <w:bCs/>
+        </w:rPr>
+      </w:pPr>
+    </w:p>
+    <w:p>
+      <w:pPr>
+        <w:rPr>
+          <w:b/>
+          <w:bCs/>
+        </w:rPr>
+      </w:pPr>
+    </w:p>
+    <w:p>
+      <w:pPr>
+        <w:rPr>
+          <w:b/>
+          <w:bCs/>
+        </w:rPr>
+      </w:pPr>
+    </w:p>
+    <w:p>
+      <w:pPr>
+        <w:rPr>
+          <w:b/>
+          <w:bCs/>
+        </w:rPr>
+      </w:pPr>
+    </w:p>
+    <w:p>
+      <w:pPr>
+        <w:rPr>
+          <w:b/>
+          <w:bCs/>
+        </w:rPr>
+      </w:pPr>
+    </w:p>
+    <w:p>
+      <w:pPr>
+        <w:rPr>
+          <w:b/>
+          <w:bCs/>
+        </w:rPr>
+      </w:pPr>
+      <w:proofErr w:type="spellStart"/>
+      <w:r>
+        <w:rPr>
+          <w:b/>
+          <w:bCs/>
+        </w:rPr>
+        <w:lastRenderedPageBreak/>
+        <w:t>button.component.scss</w:t>
+      </w:r>
+      <w:proofErr w:type="spellEnd"/>
+      <w:r>
+        <w:rPr>
+          <w:b/>
+          <w:bCs/>
+        </w:rPr>
+        <w:t xml:space="preserve"> </w:t>
+      </w:r>
+      <w:r>
+        <w:rPr>
+          <w:b/>
+          <w:bCs/>
+        </w:rPr>
+        <w:t>van los estilos que se aplican a</w:t>
+      </w:r>
+      <w:r>
+        <w:rPr>
+          <w:b/>
+          <w:bCs/>
+        </w:rPr>
+        <w:t xml:space="preserve">l  </w:t>
+      </w:r>
+      <w:proofErr w:type="spellStart"/>
+      <w:r>
+        <w:rPr>
+          <w:b/>
+          <w:bCs/>
+        </w:rPr>
+        <w:t>button</w:t>
+      </w:r>
+      <w:proofErr w:type="spellEnd"/>
+    </w:p>
+    <w:p>
+      <w:pPr>
+        <w:rPr>
+          <w:b/>
+          <w:bCs/>
+        </w:rPr>
+      </w:pPr>
+      <w:r>
+        <w:rPr>
+          <w:b/>
+          <w:bCs/>
+        </w:rPr>
+        <w:drawing>
+          <wp:inline distT="0" distB="0" distL="0" distR="0" wp14:anchorId="78773333" wp14:editId="0FF41D1F">
+            <wp:extent cx="3534268" cy="4220164"/>
+            <wp:effectExtent l="0" t="0" r="9525" b="9525"/>
+            <wp:docPr id="22" name="Imagen 22"/>
+            <wp:cNvGraphicFramePr>
+              <a:graphicFrameLocks xmlns:a="http://schemas.openxmlformats.org/drawingml/2006/main" noChangeAspect="1"/>
+            </wp:cNvGraphicFramePr>
+            <a:graphic xmlns:a="http://schemas.openxmlformats.org/drawingml/2006/main">
+              <a:graphicData uri="http://schemas.openxmlformats.org/drawingml/2006/picture">
+                <pic:pic xmlns:pic="http://schemas.openxmlformats.org/drawingml/2006/picture">
+                  <pic:nvPicPr>
+                    <pic:cNvPr id="1" name=""/>
+                    <pic:cNvPicPr/>
+                  </pic:nvPicPr>
+                  <pic:blipFill>
+                    <a:blip r:embed="rId24"/>
+                    <a:stretch>
+                      <a:fillRect/>
+                    </a:stretch>
+                  </pic:blipFill>
+                  <pic:spPr>
+                    <a:xfrm>
+                      <a:off x="0" y="0"/>
+                      <a:ext cx="3534268" cy="4220164"/>
+                    </a:xfrm>
+                    <a:prstGeom prst="rect">
+                      <a:avLst/>
+                    </a:prstGeom>
+                  </pic:spPr>
+                </pic:pic>
+              </a:graphicData>
+            </a:graphic>
+          </wp:inline>
+        </w:drawing>
+      </w:r>
+    </w:p>
+    <w:p>
+      <w:pPr>
+        <w:rPr>
+          <w:b/>
+          <w:bCs/>
+        </w:rPr>
+      </w:pPr>
+    </w:p>
+    <w:p>
+      <w:pPr>
+        <w:rPr>
+          <w:b/>
+          <w:bCs/>
+        </w:rPr>
+      </w:pPr>
+      <w:proofErr w:type="spellStart"/>
+      <w:r>
+        <w:rPr>
+          <w:b/>
+          <w:bCs/>
+        </w:rPr>
+        <w:t>loader.component.scss</w:t>
+      </w:r>
+      <w:proofErr w:type="spellEnd"/>
+      <w:r>
+        <w:rPr>
+          <w:b/>
+          <w:bCs/>
+        </w:rPr>
+        <w:t xml:space="preserve"> </w:t>
+      </w:r>
+      <w:r>
+        <w:rPr>
+          <w:b/>
+          <w:bCs/>
+        </w:rPr>
+        <w:t>van los estilos que se aplican a</w:t>
+      </w:r>
+      <w:r>
+        <w:rPr>
+          <w:b/>
+          <w:bCs/>
+        </w:rPr>
+        <w:t xml:space="preserve">l  </w:t>
+      </w:r>
+      <w:proofErr w:type="spellStart"/>
+      <w:r>
+        <w:rPr>
+          <w:b/>
+          <w:bCs/>
+        </w:rPr>
+        <w:t>loader</w:t>
+      </w:r>
+      <w:proofErr w:type="spellEnd"/>
+    </w:p>
+    <w:p>
+      <w:pPr>
+        <w:rPr>
+          <w:b/>
+          <w:bCs/>
+        </w:rPr>
+      </w:pPr>
+      <w:r>
+        <w:rPr>
+          <w:b/>
+          <w:bCs/>
+        </w:rPr>
+        <w:drawing>
+          <wp:inline distT="0" distB="0" distL="0" distR="0" wp14:anchorId="310F00C4" wp14:editId="279D355F">
+            <wp:extent cx="3353268" cy="3019846"/>
+            <wp:effectExtent l="0" t="0" r="0" b="9525"/>
+            <wp:docPr id="23" name="Imagen 23"/>
+            <wp:cNvGraphicFramePr>
+              <a:graphicFrameLocks xmlns:a="http://schemas.openxmlformats.org/drawingml/2006/main" noChangeAspect="1"/>
+            </wp:cNvGraphicFramePr>
+            <a:graphic xmlns:a="http://schemas.openxmlformats.org/drawingml/2006/main">
+              <a:graphicData uri="http://schemas.openxmlformats.org/drawingml/2006/picture">
+                <pic:pic xmlns:pic="http://schemas.openxmlformats.org/drawingml/2006/picture">
+                  <pic:nvPicPr>
+                    <pic:cNvPr id="1" name=""/>
+                    <pic:cNvPicPr/>
+                  </pic:nvPicPr>
+                  <pic:blipFill>
+                    <a:blip r:embed="rId25"/>
+                    <a:stretch>
+                      <a:fillRect/>
+                    </a:stretch>
+                  </pic:blipFill>
+                  <pic:spPr>
+                    <a:xfrm>
+                      <a:off x="0" y="0"/>
+                      <a:ext cx="3353268" cy="3019846"/>
+                    </a:xfrm>
+                    <a:prstGeom prst="rect">
+                      <a:avLst/>
+                    </a:prstGeom>
+                  </pic:spPr>
+                </pic:pic>
+              </a:graphicData>
+            </a:graphic>
+          </wp:inline>
+        </w:drawing>
+      </w:r>
+    </w:p>
+    <w:p>
+      <w:pPr>
+        <w:rPr>
+          <w:b/>
+          <w:bCs/>
+        </w:rPr>
+      </w:pPr>
+    </w:p>
+    <w:p>
+      <w:pPr>
+        <w:rPr>
+          <w:b/>
+          <w:bCs/>
+        </w:rPr>
+      </w:pPr>
+    </w:p>
+    <w:p>
+      <w:r>
+        <w:rPr>
+          <w:b/>
+          <w:bCs/>
+        </w:rPr>
+        <w:lastRenderedPageBreak/>
+        <w:t xml:space="preserve">• Convertir lógica JS a </w:t>
+      </w:r>
+      <w:proofErr w:type="spellStart"/>
+      <w:r>
+        <w:rPr>
+          <w:b/>
+          <w:bCs/>
+        </w:rPr>
+        <w:t>TypeScript</w:t>
+      </w:r>
+      <w:proofErr w:type="spellEnd"/>
+      <w:r>
+        <w:rPr>
+          <w:b/>
+          <w:bCs/>
+        </w:rPr>
+        <w:t xml:space="preserve"> usando data </w:t>
+      </w:r>
+      <w:proofErr w:type="spellStart"/>
+      <w:r>
+        <w:rPr>
+          <w:b/>
+          <w:bCs/>
+        </w:rPr>
+        <w:t>binding</w:t>
+      </w:r>
+      <w:proofErr w:type="spellEnd"/>
+      <w:r>
+        <w:rPr>
+          <w:b/>
+          <w:bCs/>
+        </w:rPr>
+        <w:t xml:space="preserve"> y servicios</w:t>
+      </w:r>
       <w:r>
         <w:t>.</w:t>
       </w:r>
+    </w:p>
+    <w:p>
+      <w:r>
+        <w:t>Vamos a crear</w:t>
+      </w:r>
+      <w:r>
+        <w:t xml:space="preserve"> un contador de clics para el botón:</w:t>
+      </w:r>
+      <w:r>
+        <w:br/>
+      </w:r>
+      <w:r>
+        <w:t xml:space="preserve">Esto crea </w:t>
+      </w:r>
+      <w:proofErr w:type="spellStart"/>
+      <w:r>
+        <w:t>src</w:t>
+      </w:r>
+      <w:proofErr w:type="spellEnd"/>
+      <w:r>
+        <w:t>/app/</w:t>
+      </w:r>
+      <w:proofErr w:type="spellStart"/>
+      <w:r>
+        <w:t>services</w:t>
+      </w:r>
+      <w:proofErr w:type="spellEnd"/>
+      <w:r>
+        <w:t>/</w:t>
+      </w:r>
+      <w:proofErr w:type="spellStart"/>
+      <w:r>
+        <w:t>button.service.ts</w:t>
+      </w:r>
+      <w:proofErr w:type="spellEnd"/>
+    </w:p>
+    <w:p>
+      <w:r>
+        <w:drawing>
+          <wp:inline distT="0" distB="0" distL="0" distR="0" wp14:anchorId="73A130CD" wp14:editId="6868D228">
+            <wp:extent cx="6691630" cy="638810"/>
+            <wp:effectExtent l="0" t="0" r="0" b="0"/>
+            <wp:docPr id="24" name="Imagen 24"/>
+            <wp:cNvGraphicFramePr>
+              <a:graphicFrameLocks xmlns:a="http://schemas.openxmlformats.org/drawingml/2006/main" noChangeAspect="1"/>
+            </wp:cNvGraphicFramePr>
+            <a:graphic xmlns:a="http://schemas.openxmlformats.org/drawingml/2006/main">
+              <a:graphicData uri="http://schemas.openxmlformats.org/drawingml/2006/picture">
+                <pic:pic xmlns:pic="http://schemas.openxmlformats.org/drawingml/2006/picture">
+                  <pic:nvPicPr>
+                    <pic:cNvPr id="1" name=""/>
+                    <pic:cNvPicPr/>
+                  </pic:nvPicPr>
+                  <pic:blipFill>
+                    <a:blip r:embed="rId26"/>
+                    <a:stretch>
+                      <a:fillRect/>
+                    </a:stretch>
+                  </pic:blipFill>
+                  <pic:spPr>
+                    <a:xfrm>
+                      <a:off x="0" y="0"/>
+                      <a:ext cx="6691630" cy="638810"/>
+                    </a:xfrm>
+                    <a:prstGeom prst="rect">
+                      <a:avLst/>
+                    </a:prstGeom>
+                  </pic:spPr>
+                </pic:pic>
+              </a:graphicData>
+            </a:graphic>
+          </wp:inline>
+        </w:drawing>
+      </w:r>
+    </w:p>
+    <w:p/>
+    <w:p>
+      <w:proofErr w:type="spellStart"/>
+      <w:r>
+        <w:t>button.service.ts</w:t>
+      </w:r>
+      <w:proofErr w:type="spellEnd"/>
+      <w:r>
+        <w:br/>
+      </w:r>
+      <w:r>
+        <w:t xml:space="preserve">Aquí usamos </w:t>
+      </w:r>
+      <w:proofErr w:type="spellStart"/>
+      <w:r>
+        <w:t>BehaviorSubject</w:t>
+      </w:r>
+      <w:proofErr w:type="spellEnd"/>
+      <w:r>
+        <w:t xml:space="preserve"> de </w:t>
+      </w:r>
+      <w:proofErr w:type="spellStart"/>
+      <w:r>
+        <w:t>RxJS</w:t>
+      </w:r>
+      <w:proofErr w:type="spellEnd"/>
+      <w:r>
+        <w:t xml:space="preserve"> para mantener el estado del contador y permitir que cualquier componente se suscriba y actualice automáticamente.</w:t>
+      </w:r>
+      <w:r>
+        <w:br/>
+      </w:r>
+      <w:r>
+        <w:drawing>
+          <wp:inline distT="0" distB="0" distL="0" distR="0" wp14:anchorId="0707BE32" wp14:editId="4F184A12">
+            <wp:extent cx="3867690" cy="2819794"/>
+            <wp:effectExtent l="0" t="0" r="0" b="0"/>
+            <wp:docPr id="26" name="Imagen 26"/>
+            <wp:cNvGraphicFramePr>
+              <a:graphicFrameLocks xmlns:a="http://schemas.openxmlformats.org/drawingml/2006/main" noChangeAspect="1"/>
+            </wp:cNvGraphicFramePr>
+            <a:graphic xmlns:a="http://schemas.openxmlformats.org/drawingml/2006/main">
+              <a:graphicData uri="http://schemas.openxmlformats.org/drawingml/2006/picture">
+                <pic:pic xmlns:pic="http://schemas.openxmlformats.org/drawingml/2006/picture">
+                  <pic:nvPicPr>
+                    <pic:cNvPr id="1" name=""/>
+                    <pic:cNvPicPr/>
+                  </pic:nvPicPr>
+                  <pic:blipFill>
+                    <a:blip r:embed="rId27"/>
+                    <a:stretch>
+                      <a:fillRect/>
+                    </a:stretch>
+                  </pic:blipFill>
+                  <pic:spPr>
+                    <a:xfrm>
+                      <a:off x="0" y="0"/>
+                      <a:ext cx="3867690" cy="2819794"/>
+                    </a:xfrm>
+                    <a:prstGeom prst="rect">
+                      <a:avLst/>
+                    </a:prstGeom>
+                  </pic:spPr>
+                </pic:pic>
+              </a:graphicData>
+            </a:graphic>
+          </wp:inline>
+        </w:drawing>
+      </w:r>
+    </w:p>
+    <w:p>
+      <w:r>
+        <w:t xml:space="preserve">Usar data </w:t>
+      </w:r>
+      <w:proofErr w:type="spellStart"/>
+      <w:r>
+        <w:t>binding</w:t>
+      </w:r>
+      <w:proofErr w:type="spellEnd"/>
+      <w:r>
+        <w:t xml:space="preserve"> en el componente</w:t>
+      </w:r>
+    </w:p>
+    <w:p>
+      <w:r>
+        <w:t xml:space="preserve">Ahora en </w:t>
+      </w:r>
+      <w:proofErr w:type="spellStart"/>
+      <w:r>
+        <w:t>button.component.ts</w:t>
+      </w:r>
+      <w:proofErr w:type="spellEnd"/>
+      <w:r>
+        <w:t>:</w:t>
+      </w:r>
+    </w:p>
+    <w:p>
+      <w:r>
+        <w:drawing>
+          <wp:inline distT="0" distB="0" distL="0" distR="0" wp14:anchorId="0CBA267D" wp14:editId="0AC0B3B5">
+            <wp:extent cx="3592146" cy="2867004"/>
+            <wp:effectExtent l="0" t="0" r="0" b="0"/>
+            <wp:docPr id="27" name="Imagen 27"/>
+            <wp:cNvGraphicFramePr>
+              <a:graphicFrameLocks xmlns:a="http://schemas.openxmlformats.org/drawingml/2006/main" noChangeAspect="1"/>
+            </wp:cNvGraphicFramePr>
+            <a:graphic xmlns:a="http://schemas.openxmlformats.org/drawingml/2006/main">
+              <a:graphicData uri="http://schemas.openxmlformats.org/drawingml/2006/picture">
+                <pic:pic xmlns:pic="http://schemas.openxmlformats.org/drawingml/2006/picture">
+                  <pic:nvPicPr>
+                    <pic:cNvPr id="1" name=""/>
+                    <pic:cNvPicPr/>
+                  </pic:nvPicPr>
+                  <pic:blipFill>
+                    <a:blip r:embed="rId28"/>
+                    <a:stretch>
+                      <a:fillRect/>
+                    </a:stretch>
+                  </pic:blipFill>
+                  <pic:spPr>
+                    <a:xfrm>
+                      <a:off x="0" y="0"/>
+                      <a:ext cx="3600273" cy="2873490"/>
+                    </a:xfrm>
+                    <a:prstGeom prst="rect">
+                      <a:avLst/>
+                    </a:prstGeom>
+                  </pic:spPr>
+                </pic:pic>
+              </a:graphicData>
+            </a:graphic>
+          </wp:inline>
+        </w:drawing>
+      </w:r>
+    </w:p>
+    <w:p>
+      <w:proofErr w:type="spellStart"/>
+      <w:r>
+        <w:lastRenderedPageBreak/>
+        <w:t>Template</w:t>
+      </w:r>
+      <w:proofErr w:type="spellEnd"/>
+      <w:r>
+        <w:t xml:space="preserve"> con data </w:t>
+      </w:r>
+      <w:proofErr w:type="spellStart"/>
+      <w:r>
+        <w:t>binding</w:t>
+      </w:r>
+      <w:proofErr w:type="spellEnd"/>
+    </w:p>
+    <w:p>
+      <w:r>
+        <w:t>En button.component.html</w:t>
+      </w:r>
+    </w:p>
+    <w:p>
+      <w:r>
+        <w:t xml:space="preserve">{{ </w:t>
+      </w:r>
+      <w:proofErr w:type="spellStart"/>
+      <w:r>
+        <w:t>count</w:t>
+      </w:r>
+      <w:proofErr w:type="spellEnd"/>
+      <w:r>
+        <w:t xml:space="preserve"> }} → Interpolación de Angular para mostrar el valor.</w:t>
+      </w:r>
+    </w:p>
+    <w:p>
+      <w:r>
+        <w:t>(</w:t>
+      </w:r>
+      <w:proofErr w:type="spellStart"/>
+      <w:r>
+        <w:t>click</w:t>
+      </w:r>
+      <w:proofErr w:type="spellEnd"/>
+      <w:r>
+        <w:t>)="</w:t>
+      </w:r>
+      <w:proofErr w:type="spellStart"/>
+      <w:r>
+        <w:t>onClick</w:t>
+      </w:r>
+      <w:proofErr w:type="spellEnd"/>
+      <w:r>
+        <w:t xml:space="preserve">()" → </w:t>
+      </w:r>
+      <w:proofErr w:type="spellStart"/>
+      <w:r>
+        <w:t>Event</w:t>
+      </w:r>
+      <w:proofErr w:type="spellEnd"/>
       <w:r>
         <w:t xml:space="preserve"> </w:t>
       </w:r>
       <w:proofErr w:type="spellStart"/>
       <w:r>
-        <w:t>To</w:t>
-      </w:r>
-      <w:proofErr w:type="spellEnd"/>
-      <w:r>
-        <w:t xml:space="preserve"> https://github.com/Eduardo-L5/Curso_Miercoles_Subneteados_SEP_DIC_2025.git</w:t>
-      </w:r>
-    </w:p>
-    <w:p>
-      <w:r>
-        <w:t xml:space="preserve"> * [new </w:t>
-      </w:r>
-      <w:proofErr w:type="spellStart"/>
-      <w:r>
-        <w:t>branch</w:t>
-      </w:r>
-      <w:proofErr w:type="spellEnd"/>
-      <w:r>
-        <w:t>]      DANIEL_ORTIZ -&gt; DANIEL_ORTIZ</w:t>
-      </w:r>
-    </w:p>
-    <w:p>
-      <w:proofErr w:type="spellStart"/>
-      <w:r>
-        <w:t>branch</w:t>
-      </w:r>
-      <w:proofErr w:type="spellEnd"/>
-      <w:r>
-        <w:t xml:space="preserve"> 'DANIEL_ORTIZ' set up </w:t>
-      </w:r>
-      <w:proofErr w:type="spellStart"/>
-      <w:r>
-        <w:t>to</w:t>
-      </w:r>
-      <w:proofErr w:type="spellEnd"/>
-      <w:r>
-        <w:t xml:space="preserve"> </w:t>
-      </w:r>
-      <w:proofErr w:type="spellStart"/>
-      <w:r>
-        <w:t>track</w:t>
-      </w:r>
-      <w:proofErr w:type="spellEnd"/>
-      <w:r>
-        <w:t xml:space="preserve"> '</w:t>
-      </w:r>
-      <w:proofErr w:type="spellStart"/>
-      <w:r>
-        <w:t>origin</w:t>
-      </w:r>
-      <w:proofErr w:type="spellEnd"/>
-      <w:r>
-        <w:t>/DANIEL_ORTIZ'.</w:t>
+        <w:t>binding</w:t>
+      </w:r>
+      <w:proofErr w:type="spellEnd"/>
+      <w:r>
+        <w:t xml:space="preserve"> para manejar el clic</w:t>
+      </w:r>
+    </w:p>
+    <w:p>
+      <w:r>
+        <w:drawing>
+          <wp:inline distT="0" distB="0" distL="0" distR="0" wp14:anchorId="24A0796B" wp14:editId="3B5ED636">
+            <wp:extent cx="4525006" cy="2057687"/>
+            <wp:effectExtent l="0" t="0" r="9525" b="0"/>
+            <wp:docPr id="28" name="Imagen 28"/>
+            <wp:cNvGraphicFramePr>
+              <a:graphicFrameLocks xmlns:a="http://schemas.openxmlformats.org/drawingml/2006/main" noChangeAspect="1"/>
+            </wp:cNvGraphicFramePr>
+            <a:graphic xmlns:a="http://schemas.openxmlformats.org/drawingml/2006/main">
+              <a:graphicData uri="http://schemas.openxmlformats.org/drawingml/2006/picture">
+                <pic:pic xmlns:pic="http://schemas.openxmlformats.org/drawingml/2006/picture">
+                  <pic:nvPicPr>
+                    <pic:cNvPr id="1" name=""/>
+                    <pic:cNvPicPr/>
+                  </pic:nvPicPr>
+                  <pic:blipFill>
+                    <a:blip r:embed="rId29"/>
+                    <a:stretch>
+                      <a:fillRect/>
+                    </a:stretch>
+                  </pic:blipFill>
+                  <pic:spPr>
+                    <a:xfrm>
+                      <a:off x="0" y="0"/>
+                      <a:ext cx="4525006" cy="2057687"/>
+                    </a:xfrm>
+                    <a:prstGeom prst="rect">
+                      <a:avLst/>
+                    </a:prstGeom>
+                  </pic:spPr>
+                </pic:pic>
+              </a:graphicData>
+            </a:graphic>
+          </wp:inline>
+        </w:drawing>
       </w:r>
     </w:p>
     <w:p/>
     <w:p>
       <w:r>
-        <w:rPr>
-          <w:b/>
-          <w:bCs/>
-        </w:rPr>
-        <w:t>5</w:t>
-      </w:r>
-      <w:r>
-        <w:rPr>
-          <w:b/>
-          <w:bCs/>
-        </w:rPr>
-        <w:t>.</w:t>
-      </w:r>
-      <w:r>
-        <w:rPr>
-          <w:b/>
-          <w:bCs/>
-        </w:rPr>
-        <w:t xml:space="preserve"> se hace </w:t>
-      </w:r>
-      <w:proofErr w:type="spellStart"/>
-      <w:r>
-        <w:rPr>
-          <w:b/>
-          <w:bCs/>
-        </w:rPr>
-        <w:t>push</w:t>
-      </w:r>
-      <w:proofErr w:type="spellEnd"/>
-      <w:r>
-        <w:rPr>
-          <w:b/>
-          <w:bCs/>
-        </w:rPr>
-        <w:t xml:space="preserve"> para subir la rama</w:t>
-      </w:r>
-      <w:r>
-        <w:br/>
-      </w:r>
-      <w:r>
-        <w:br/>
-      </w:r>
-      <w:r>
-        <w:t xml:space="preserve">01.Curso\curso </w:t>
-      </w:r>
-      <w:proofErr w:type="spellStart"/>
-      <w:r>
-        <w:t>miercoles</w:t>
-      </w:r>
-      <w:proofErr w:type="spellEnd"/>
-      <w:r>
-        <w:t xml:space="preserve">\DANIEL-ORTIZ&gt; </w:t>
-      </w:r>
-      <w:proofErr w:type="spellStart"/>
-      <w:r>
-        <w:t>git</w:t>
-      </w:r>
-      <w:proofErr w:type="spellEnd"/>
-      <w:r>
-        <w:t xml:space="preserve"> </w:t>
-      </w:r>
-      <w:proofErr w:type="spellStart"/>
-      <w:r>
-        <w:t>push</w:t>
-      </w:r>
-      <w:proofErr w:type="spellEnd"/>
-    </w:p>
-    <w:p>
-      <w:proofErr w:type="spellStart"/>
-      <w:r>
-        <w:t>Everything</w:t>
-      </w:r>
-      <w:proofErr w:type="spellEnd"/>
-      <w:r>
-        <w:t xml:space="preserve"> up-</w:t>
-      </w:r>
-      <w:proofErr w:type="spellStart"/>
-      <w:r>
-        <w:t>to</w:t>
-      </w:r>
-      <w:proofErr w:type="spellEnd"/>
-      <w:r>
-        <w:t>-date</w:t>
-      </w:r>
-    </w:p>
+        <w:t xml:space="preserve">Lógica para el </w:t>
+      </w:r>
+      <w:proofErr w:type="spellStart"/>
+      <w:r>
+        <w:t>loader</w:t>
+      </w:r>
+      <w:proofErr w:type="spellEnd"/>
+      <w:r>
+        <w:t xml:space="preserve"> (animación condicional)</w:t>
+      </w:r>
+    </w:p>
+    <w:p>
+      <w:r>
+        <w:t xml:space="preserve">los cuadrados del </w:t>
+      </w:r>
+      <w:proofErr w:type="spellStart"/>
+      <w:r>
+        <w:t>loader</w:t>
+      </w:r>
+      <w:proofErr w:type="spellEnd"/>
+      <w:r>
+        <w:t xml:space="preserve">  solo </w:t>
+      </w:r>
+      <w:r>
+        <w:t xml:space="preserve">aparecen </w:t>
+      </w:r>
+      <w:r>
+        <w:t>cuando ocurre algo</w:t>
+      </w:r>
+    </w:p>
+    <w:p>
+      <w:r>
+        <w:drawing>
+          <wp:inline distT="0" distB="0" distL="0" distR="0" wp14:anchorId="08ECCF84" wp14:editId="7FE1B17F">
+            <wp:extent cx="3924848" cy="2400635"/>
+            <wp:effectExtent l="0" t="0" r="0" b="0"/>
+            <wp:docPr id="29" name="Imagen 29"/>
+            <wp:cNvGraphicFramePr>
+              <a:graphicFrameLocks xmlns:a="http://schemas.openxmlformats.org/drawingml/2006/main" noChangeAspect="1"/>
+            </wp:cNvGraphicFramePr>
+            <a:graphic xmlns:a="http://schemas.openxmlformats.org/drawingml/2006/main">
+              <a:graphicData uri="http://schemas.openxmlformats.org/drawingml/2006/picture">
+                <pic:pic xmlns:pic="http://schemas.openxmlformats.org/drawingml/2006/picture">
+                  <pic:nvPicPr>
+                    <pic:cNvPr id="1" name=""/>
+                    <pic:cNvPicPr/>
+                  </pic:nvPicPr>
+                  <pic:blipFill>
+                    <a:blip r:embed="rId30"/>
+                    <a:stretch>
+                      <a:fillRect/>
+                    </a:stretch>
+                  </pic:blipFill>
+                  <pic:spPr>
+                    <a:xfrm>
+                      <a:off x="0" y="0"/>
+                      <a:ext cx="3924848" cy="2400635"/>
+                    </a:xfrm>
+                    <a:prstGeom prst="rect">
+                      <a:avLst/>
+                    </a:prstGeom>
+                  </pic:spPr>
+                </pic:pic>
+              </a:graphicData>
+            </a:graphic>
+          </wp:inline>
+        </w:drawing>
+      </w:r>
+    </w:p>
+    <w:p/>
+    <w:p/>
     <w:sectPr>
       <w:pgSz w:w="12240" w:h="15840" w:code="5"/>
       <w:pgMar w:top="851" w:right="851" w:bottom="851" w:left="851" w:header="709" w:footer="709" w:gutter="0"/>
@@ -1093,6 +3212,7 @@
     <w:name w:val="Strong"/>
     <w:basedOn w:val="Fuentedeprrafopredeter"/>
     <w:uiPriority w:val="22"/>
+    <w:qFormat/>
     <w:rsid w:val="00047ED0"/>
     <w:rPr>
       <w:b/>

</xml_diff>